<commit_message>
Add license and attribution to Word document
</commit_message>
<xml_diff>
--- a/Agile Project Delivery System Framework.docx
+++ b/Agile Project Delivery System Framework.docx
@@ -13290,6 +13290,95 @@
         </w:numPr>
         <w:jc w:val="both"/>
       </w:pPr>
+    </w:p>
+    <w:p>
+      <w:r>
+        <w:br w:type="page"/>
+      </w:r>
+    </w:p>
+    <w:p>
+      <w:pPr>
+        <w:pStyle w:val="Heading1"/>
+        <w:jc w:val="center"/>
+      </w:pPr>
+      <w:r>
+        <w:t>License</w:t>
+      </w:r>
+    </w:p>
+    <w:p/>
+    <w:p>
+      <w:pPr>
+        <w:jc w:val="center"/>
+      </w:pPr>
+      <w:r>
+        <w:rPr>
+          <w:b/>
+          <w:sz w:val="24"/>
+        </w:rPr>
+        <w:t>Creative Commons Attribution-ShareAlike 4.0 International (CC BY-SA 4.0)</w:t>
+      </w:r>
+    </w:p>
+    <w:p/>
+    <w:p>
+      <w:r>
+        <w:t>This work is licensed under the Creative Commons Attribution-ShareAlike 4.0 International License. To view a copy of this license, visit https://creativecommons.org/licenses/by-sa/4.0/</w:t>
+      </w:r>
+    </w:p>
+    <w:p/>
+    <w:p>
+      <w:pPr>
+        <w:pStyle w:val="Heading2"/>
+      </w:pPr>
+      <w:r>
+        <w:t>Attribution</w:t>
+      </w:r>
+    </w:p>
+    <w:p>
+      <w:r>
+        <w:rPr>
+          <w:b/>
+        </w:rPr>
+        <w:t>Attribution requirement:</w:t>
+      </w:r>
+      <w:r>
+        <w:t xml:space="preserve"> Any use, modification, or distribution must include the statement: "Based on the Agile Project Delivery System (APDS) Framework by Vahid Hakami" or similar clear credit.</w:t>
+      </w:r>
+    </w:p>
+    <w:p/>
+    <w:p>
+      <w:pPr>
+        <w:pStyle w:val="Heading2"/>
+      </w:pPr>
+      <w:r>
+        <w:t>ShareAlike Condition</w:t>
+      </w:r>
+    </w:p>
+    <w:p>
+      <w:r>
+        <w:t>Any adapted or modified versions must be distributed under the same CC BY-SA 4.0 license.</w:t>
+      </w:r>
+    </w:p>
+    <w:p/>
+    <w:p>
+      <w:pPr>
+        <w:pStyle w:val="Heading2"/>
+      </w:pPr>
+      <w:r>
+        <w:t>Author</w:t>
+      </w:r>
+    </w:p>
+    <w:p>
+      <w:r>
+        <w:rPr>
+          <w:b/>
+        </w:rPr>
+        <w:t>Vahid Hakami</w:t>
+      </w:r>
+    </w:p>
+    <w:p>
+      <w:r>
+        <w:t>GitHub: https://github.com/pmoagile/APDS-Framework</w:t>
+      </w:r>
     </w:p>
     <w:sectPr>
       <w:pgSz w:w="12240" w:h="15840"/>

</xml_diff>